<commit_message>
summaries creados a mano
</commit_message>
<xml_diff>
--- a/input/dil/IEO DIL - Survey - Survey Authorities FINAL.docx
+++ b/input/dil/IEO DIL - Survey - Survey Authorities FINAL.docx
@@ -5121,12 +5121,8 @@
     </w:p>
     <w:p>
       <w:pPr>
-        <w:pStyle w:val="ListParagraph"/>
-        <w:numPr>
-          <w:ilvl w:val="0"/>
-          <w:numId w:val="34"/>
-        </w:numPr>
         <w:spacing w:before="0" w:after="240" w:line="247" w:lineRule="auto"/>
+        <w:ind w:left="360"/>
         <w:rPr>
           <w:rFonts w:ascii="Segoe UI" w:eastAsia="Arial" w:hAnsi="Segoe UI" w:cs="Segoe UI"/>
           <w:sz w:val="21"/>
@@ -5144,12 +5140,8 @@
     </w:p>
     <w:p>
       <w:pPr>
-        <w:pStyle w:val="ListParagraph"/>
-        <w:numPr>
-          <w:ilvl w:val="0"/>
-          <w:numId w:val="34"/>
-        </w:numPr>
         <w:spacing w:before="0" w:after="240" w:line="247" w:lineRule="auto"/>
+        <w:ind w:left="360"/>
         <w:rPr>
           <w:rFonts w:ascii="Segoe UI" w:eastAsia="Arial" w:hAnsi="Segoe UI" w:cs="Segoe UI"/>
           <w:sz w:val="21"/>
@@ -5167,12 +5159,8 @@
     </w:p>
     <w:p>
       <w:pPr>
-        <w:pStyle w:val="ListParagraph"/>
-        <w:numPr>
-          <w:ilvl w:val="0"/>
-          <w:numId w:val="34"/>
-        </w:numPr>
         <w:spacing w:before="0" w:after="240" w:line="247" w:lineRule="auto"/>
+        <w:ind w:left="360"/>
         <w:rPr>
           <w:rFonts w:ascii="Segoe UI" w:eastAsia="Arial" w:hAnsi="Segoe UI" w:cs="Segoe UI"/>
           <w:sz w:val="21"/>
@@ -5190,12 +5178,8 @@
     </w:p>
     <w:p>
       <w:pPr>
-        <w:pStyle w:val="ListParagraph"/>
-        <w:numPr>
-          <w:ilvl w:val="0"/>
-          <w:numId w:val="34"/>
-        </w:numPr>
         <w:spacing w:before="0" w:after="240" w:line="247" w:lineRule="auto"/>
+        <w:ind w:left="360"/>
         <w:rPr>
           <w:rFonts w:ascii="Segoe UI" w:eastAsia="Arial" w:hAnsi="Segoe UI" w:cs="Segoe UI"/>
           <w:sz w:val="21"/>
@@ -5261,12 +5245,8 @@
     </w:p>
     <w:p>
       <w:pPr>
-        <w:pStyle w:val="ListParagraph"/>
-        <w:numPr>
-          <w:ilvl w:val="0"/>
-          <w:numId w:val="34"/>
-        </w:numPr>
         <w:spacing w:before="0" w:after="240" w:line="247" w:lineRule="auto"/>
+        <w:ind w:left="360"/>
         <w:rPr>
           <w:rFonts w:ascii="Segoe UI" w:eastAsia="Arial" w:hAnsi="Segoe UI" w:cs="Segoe UI"/>
           <w:sz w:val="21"/>
@@ -5284,12 +5264,8 @@
     </w:p>
     <w:p>
       <w:pPr>
-        <w:pStyle w:val="ListParagraph"/>
-        <w:numPr>
-          <w:ilvl w:val="0"/>
-          <w:numId w:val="34"/>
-        </w:numPr>
         <w:spacing w:before="0" w:after="240" w:line="247" w:lineRule="auto"/>
+        <w:ind w:left="360"/>
         <w:rPr>
           <w:rFonts w:ascii="Segoe UI" w:eastAsia="Arial" w:hAnsi="Segoe UI" w:cs="Segoe UI"/>
           <w:sz w:val="21"/>
@@ -5307,12 +5283,8 @@
     </w:p>
     <w:p>
       <w:pPr>
-        <w:pStyle w:val="ListParagraph"/>
-        <w:numPr>
-          <w:ilvl w:val="0"/>
-          <w:numId w:val="34"/>
-        </w:numPr>
         <w:spacing w:before="0" w:after="240" w:line="247" w:lineRule="auto"/>
+        <w:ind w:left="360"/>
         <w:rPr>
           <w:rFonts w:ascii="Segoe UI" w:eastAsia="Arial" w:hAnsi="Segoe UI" w:cs="Segoe UI"/>
           <w:sz w:val="21"/>
@@ -5339,12 +5311,8 @@
     </w:p>
     <w:p>
       <w:pPr>
-        <w:pStyle w:val="ListParagraph"/>
-        <w:numPr>
-          <w:ilvl w:val="0"/>
-          <w:numId w:val="34"/>
-        </w:numPr>
         <w:spacing w:before="0" w:after="240" w:line="247" w:lineRule="auto"/>
+        <w:ind w:left="360"/>
         <w:rPr>
           <w:rFonts w:ascii="Segoe UI" w:eastAsia="Arial" w:hAnsi="Segoe UI" w:cs="Segoe UI"/>
           <w:sz w:val="21"/>
@@ -5388,12 +5356,8 @@
     </w:p>
     <w:p>
       <w:pPr>
-        <w:pStyle w:val="ListParagraph"/>
-        <w:numPr>
-          <w:ilvl w:val="0"/>
-          <w:numId w:val="34"/>
-        </w:numPr>
         <w:spacing w:before="0" w:after="240" w:line="247" w:lineRule="auto"/>
+        <w:ind w:left="360"/>
         <w:rPr>
           <w:rFonts w:ascii="Segoe UI" w:eastAsia="Arial" w:hAnsi="Segoe UI" w:cs="Segoe UI"/>
           <w:sz w:val="21"/>
@@ -17526,6 +17490,26 @@
 </file>
 
 <file path=customXml/item1.xml><?xml version="1.0" encoding="utf-8"?>
+<p:properties xmlns:p="http://schemas.microsoft.com/office/2006/metadata/properties" xmlns:xsi="http://www.w3.org/2001/XMLSchema-instance" xmlns:pc="http://schemas.microsoft.com/office/infopath/2007/PartnerControls">
+  <documentManagement>
+    <lcf76f155ced4ddcb4097134ff3c332f xmlns="a234ba1d-9967-4080-847c-2fc34f64b8ca">
+      <Terms xmlns="http://schemas.microsoft.com/office/infopath/2007/PartnerControls"/>
+    </lcf76f155ced4ddcb4097134ff3c332f>
+    <TaxCatchAll xmlns="bfa9e1ee-5524-4fab-801b-66d9baa27028" xsi:nil="true"/>
+  </documentManagement>
+</p:properties>
+</file>
+
+<file path=customXml/item2.xml><?xml version="1.0" encoding="utf-8"?>
+<?mso-contentType ?>
+<FormTemplates xmlns="http://schemas.microsoft.com/sharepoint/v3/contenttype/forms">
+  <Display>DocumentLibraryForm</Display>
+  <Edit>DocumentLibraryForm</Edit>
+  <New>DocumentLibraryForm</New>
+</FormTemplates>
+</file>
+
+<file path=customXml/item3.xml><?xml version="1.0" encoding="utf-8"?>
 <ct:contentTypeSchema xmlns:ct="http://schemas.microsoft.com/office/2006/metadata/contentType" xmlns:ma="http://schemas.microsoft.com/office/2006/metadata/properties/metaAttributes" ct:_="" ma:_="" ma:contentTypeName="Document" ma:contentTypeID="0x0101009CC0A34B3A6D3B40927557A1B041BDE3" ma:contentTypeVersion="12" ma:contentTypeDescription="Create a new document." ma:contentTypeScope="" ma:versionID="ebce7c7b297da2c98fd5636e4a13e307">
   <xsd:schema xmlns:xsd="http://www.w3.org/2001/XMLSchema" xmlns:xs="http://www.w3.org/2001/XMLSchema" xmlns:p="http://schemas.microsoft.com/office/2006/metadata/properties" xmlns:ns2="a234ba1d-9967-4080-847c-2fc34f64b8ca" xmlns:ns3="bfa9e1ee-5524-4fab-801b-66d9baa27028" targetNamespace="http://schemas.microsoft.com/office/2006/metadata/properties" ma:root="true" ma:fieldsID="b786cb5e99556f470c7eb85057a17896" ns2:_="" ns3:_="">
     <xsd:import namespace="a234ba1d-9967-4080-847c-2fc34f64b8ca"/>
@@ -17726,27 +17710,26 @@
 </ct:contentTypeSchema>
 </file>
 
-<file path=customXml/item2.xml><?xml version="1.0" encoding="utf-8"?>
-<?mso-contentType ?>
-<FormTemplates xmlns="http://schemas.microsoft.com/sharepoint/v3/contenttype/forms">
-  <Display>DocumentLibraryForm</Display>
-  <Edit>DocumentLibraryForm</Edit>
-  <New>DocumentLibraryForm</New>
-</FormTemplates>
+<file path=customXml/itemProps1.xml><?xml version="1.0" encoding="utf-8"?>
+<ds:datastoreItem xmlns:ds="http://schemas.openxmlformats.org/officeDocument/2006/customXml" ds:itemID="{F63B6798-28A0-47F2-B629-8E23C6C68238}">
+  <ds:schemaRefs>
+    <ds:schemaRef ds:uri="http://schemas.microsoft.com/office/2006/metadata/properties"/>
+    <ds:schemaRef ds:uri="http://schemas.microsoft.com/office/infopath/2007/PartnerControls"/>
+    <ds:schemaRef ds:uri="a234ba1d-9967-4080-847c-2fc34f64b8ca"/>
+    <ds:schemaRef ds:uri="bfa9e1ee-5524-4fab-801b-66d9baa27028"/>
+  </ds:schemaRefs>
+</ds:datastoreItem>
 </file>
 
-<file path=customXml/item3.xml><?xml version="1.0" encoding="utf-8"?>
-<p:properties xmlns:p="http://schemas.microsoft.com/office/2006/metadata/properties" xmlns:xsi="http://www.w3.org/2001/XMLSchema-instance" xmlns:pc="http://schemas.microsoft.com/office/infopath/2007/PartnerControls">
-  <documentManagement>
-    <lcf76f155ced4ddcb4097134ff3c332f xmlns="a234ba1d-9967-4080-847c-2fc34f64b8ca">
-      <Terms xmlns="http://schemas.microsoft.com/office/infopath/2007/PartnerControls"/>
-    </lcf76f155ced4ddcb4097134ff3c332f>
-    <TaxCatchAll xmlns="bfa9e1ee-5524-4fab-801b-66d9baa27028" xsi:nil="true"/>
-  </documentManagement>
-</p:properties>
+<file path=customXml/itemProps2.xml><?xml version="1.0" encoding="utf-8"?>
+<ds:datastoreItem xmlns:ds="http://schemas.openxmlformats.org/officeDocument/2006/customXml" ds:itemID="{F488B8DE-51D2-40BB-8D23-2A3576360B9B}">
+  <ds:schemaRefs>
+    <ds:schemaRef ds:uri="http://schemas.microsoft.com/sharepoint/v3/contenttype/forms"/>
+  </ds:schemaRefs>
+</ds:datastoreItem>
 </file>
 
-<file path=customXml/itemProps1.xml><?xml version="1.0" encoding="utf-8"?>
+<file path=customXml/itemProps3.xml><?xml version="1.0" encoding="utf-8"?>
 <ds:datastoreItem xmlns:ds="http://schemas.openxmlformats.org/officeDocument/2006/customXml" ds:itemID="{A88FFEF5-A0BD-482B-8E59-B82E16D1CF0D}">
   <ds:schemaRefs>
     <ds:schemaRef ds:uri="http://schemas.microsoft.com/office/2006/metadata/contentType"/>
@@ -17765,25 +17748,6 @@
 </ds:datastoreItem>
 </file>
 
-<file path=customXml/itemProps2.xml><?xml version="1.0" encoding="utf-8"?>
-<ds:datastoreItem xmlns:ds="http://schemas.openxmlformats.org/officeDocument/2006/customXml" ds:itemID="{F488B8DE-51D2-40BB-8D23-2A3576360B9B}">
-  <ds:schemaRefs>
-    <ds:schemaRef ds:uri="http://schemas.microsoft.com/sharepoint/v3/contenttype/forms"/>
-  </ds:schemaRefs>
-</ds:datastoreItem>
-</file>
-
-<file path=customXml/itemProps3.xml><?xml version="1.0" encoding="utf-8"?>
-<ds:datastoreItem xmlns:ds="http://schemas.openxmlformats.org/officeDocument/2006/customXml" ds:itemID="{F63B6798-28A0-47F2-B629-8E23C6C68238}">
-  <ds:schemaRefs>
-    <ds:schemaRef ds:uri="http://schemas.microsoft.com/office/2006/metadata/properties"/>
-    <ds:schemaRef ds:uri="http://schemas.microsoft.com/office/infopath/2007/PartnerControls"/>
-    <ds:schemaRef ds:uri="a234ba1d-9967-4080-847c-2fc34f64b8ca"/>
-    <ds:schemaRef ds:uri="bfa9e1ee-5524-4fab-801b-66d9baa27028"/>
-  </ds:schemaRefs>
-</ds:datastoreItem>
-</file>
-
 <file path=docMetadata/LabelInfo.xml><?xml version="1.0" encoding="utf-8"?>
 <clbl:labelList xmlns:clbl="http://schemas.microsoft.com/office/2020/mipLabelMetadata">
   <clbl:label id="{8085fa43-302e-45bd-b171-a6648c3b6be7}" enabled="0" method="" siteId="{8085fa43-302e-45bd-b171-a6648c3b6be7}" removed="1"/>

</xml_diff>